<commit_message>
Adjustments to better align with author's inference pipeline
</commit_message>
<xml_diff>
--- a/AGBD Notebook Pipeline Documentation.docx
+++ b/AGBD Notebook Pipeline Documentation.docx
@@ -29,13 +29,7 @@
         <w:rPr>
           <w:lang w:val="en-US"/>
         </w:rPr>
-        <w:t>As mentioned in the email, this document provides an overview</w:t>
-      </w:r>
-      <w:r>
-        <w:rPr>
-          <w:lang w:val="en-US"/>
-        </w:rPr>
-        <w:t xml:space="preserve"> </w:t>
+        <w:t xml:space="preserve">As mentioned in the email, this document provides an overview </w:t>
       </w:r>
       <w:r>
         <w:rPr>
@@ -128,13 +122,7 @@
         <w:rPr>
           <w:lang w:val="en-US"/>
         </w:rPr>
-        <w:t>S2_SR_HARMONIZED</w:t>
-      </w:r>
-      <w:r>
-        <w:rPr>
-          <w:lang w:val="en-US"/>
-        </w:rPr>
-        <w:t xml:space="preserve"> L2A product for S</w:t>
+        <w:t>S2_SR_HARMONIZED L2A product for S</w:t>
       </w:r>
       <w:r>
         <w:rPr>
@@ -222,7 +210,7 @@
         <w:rPr>
           <w:lang w:val="en-US"/>
         </w:rPr>
-        <w:t xml:space="preserve">After download, each of the four bands is normalized using the minimum and maximum values provided in the </w:t>
+        <w:t xml:space="preserve">After download, each of the four bands is normalized using the values provided in the </w:t>
       </w:r>
       <w:r>
         <w:rPr>
@@ -276,13 +264,7 @@
         <w:rPr>
           <w:lang w:val="en-US"/>
         </w:rPr>
-        <w:t>process is repeated separately for the 20</w:t>
-      </w:r>
-      <w:r>
-        <w:rPr>
-          <w:lang w:val="en-US"/>
-        </w:rPr>
-        <w:t>m</w:t>
+        <w:t>process is repeated separately for the 20m</w:t>
       </w:r>
       <w:r>
         <w:rPr>
@@ -295,13 +277,7 @@
         <w:rPr>
           <w:lang w:val="en-US"/>
         </w:rPr>
-        <w:t>and 60</w:t>
-      </w:r>
-      <w:r>
-        <w:rPr>
-          <w:lang w:val="en-US"/>
-        </w:rPr>
-        <w:t>m</w:t>
+        <w:t>and 60m</w:t>
       </w:r>
       <w:r>
         <w:rPr>
@@ -314,19 +290,7 @@
         <w:rPr>
           <w:lang w:val="en-US"/>
         </w:rPr>
-        <w:t xml:space="preserve">bands, which are bilinearly resampled onto the same grid used by the </w:t>
-      </w:r>
-      <w:r>
-        <w:rPr>
-          <w:lang w:val="en-US"/>
-        </w:rPr>
-        <w:t xml:space="preserve">10m </w:t>
-      </w:r>
-      <w:r>
-        <w:rPr>
-          <w:lang w:val="en-US"/>
-        </w:rPr>
-        <w:t xml:space="preserve">bands. </w:t>
+        <w:t xml:space="preserve">bands, which are bilinearly resampled onto the same grid used by the 10m bands. </w:t>
       </w:r>
     </w:p>
     <w:p>
@@ -362,13 +326,7 @@
         <w:rPr>
           <w:lang w:val="en-US"/>
         </w:rPr>
-        <w:t>The JAXA DSM with 3</w:t>
-      </w:r>
-      <w:r>
-        <w:rPr>
-          <w:lang w:val="en-US"/>
-        </w:rPr>
-        <w:t>0 m</w:t>
+        <w:t>The JAXA DSM with 30 m</w:t>
       </w:r>
       <w:r>
         <w:rPr>
@@ -381,13 +339,7 @@
         <w:rPr>
           <w:lang w:val="en-US"/>
         </w:rPr>
-        <w:t>resolution is then downloaded, normalized and bilinearly resampled onto the same 1</w:t>
-      </w:r>
-      <w:r>
-        <w:rPr>
-          <w:lang w:val="en-US"/>
-        </w:rPr>
-        <w:t>0m</w:t>
+        <w:t>resolution is then downloaded, normalized and bilinearly resampled onto the same 10m</w:t>
       </w:r>
       <w:r>
         <w:rPr>
@@ -442,13 +394,7 @@
         <w:rPr>
           <w:lang w:val="en-US"/>
         </w:rPr>
-        <w:t>25</w:t>
-      </w:r>
-      <w:r>
-        <w:rPr>
-          <w:lang w:val="en-US"/>
-        </w:rPr>
-        <w:t xml:space="preserve"> </w:t>
+        <w:t xml:space="preserve">25 </w:t>
       </w:r>
       <w:r>
         <w:rPr>
@@ -522,37 +468,7 @@
         <w:rPr>
           <w:lang w:val="en-US"/>
         </w:rPr>
-        <w:t xml:space="preserve">Land Cover and Land Cover Probability layers are downloaded and used to compute the Land Cover </w:t>
-      </w:r>
-      <w:r>
-        <w:rPr>
-          <w:lang w:val="en-US"/>
-        </w:rPr>
-        <w:t>Sine</w:t>
-      </w:r>
-      <w:r>
-        <w:rPr>
-          <w:lang w:val="en-US"/>
-        </w:rPr>
-        <w:t xml:space="preserve">, </w:t>
-      </w:r>
-      <w:r>
-        <w:rPr>
-          <w:lang w:val="en-US"/>
-        </w:rPr>
-        <w:t xml:space="preserve">Cosine </w:t>
-      </w:r>
-      <w:r>
-        <w:rPr>
-          <w:lang w:val="en-US"/>
-        </w:rPr>
-        <w:t xml:space="preserve">and Probability arrays, again using the formulas you provide. The results are then resampled onto the </w:t>
-      </w:r>
-      <w:r>
-        <w:rPr>
-          <w:lang w:val="en-US"/>
-        </w:rPr>
-        <w:t>10 m</w:t>
+        <w:t>Land Cover and Land Cover Probability layers are downloaded and used to compute the Land Cover Sine, Cosine and Probability arrays, again using the formulas you provide. The results are then resampled onto the 10 m</w:t>
       </w:r>
       <w:r>
         <w:rPr>
@@ -565,25 +481,7 @@
         <w:rPr>
           <w:lang w:val="en-US"/>
         </w:rPr>
-        <w:t>grid</w:t>
-      </w:r>
-      <w:r>
-        <w:rPr>
-          <w:lang w:val="en-US"/>
-        </w:rPr>
-        <w:t xml:space="preserve">, using nearest neighbor </w:t>
-      </w:r>
-      <w:r>
-        <w:rPr>
-          <w:lang w:val="en-US"/>
-        </w:rPr>
-        <w:t>resampling</w:t>
-      </w:r>
-      <w:r>
-        <w:rPr>
-          <w:lang w:val="en-US"/>
-        </w:rPr>
-        <w:t xml:space="preserve"> for Sine and Cosine and bilinear resampling for probability.</w:t>
+        <w:t>grid, using nearest neighbor resampling for Sine and Cosine and bilinear resampling for probability.</w:t>
       </w:r>
     </w:p>
     <w:p>
@@ -760,15 +658,7 @@
           <w:szCs w:val="28"/>
           <w:lang w:val="en-US"/>
         </w:rPr>
-        <w:t xml:space="preserve">s </w:t>
-      </w:r>
-      <w:r>
-        <w:rPr>
-          <w:sz w:val="28"/>
-          <w:szCs w:val="28"/>
-          <w:lang w:val="en-US"/>
-        </w:rPr>
-        <w:t>Sources on GEE</w:t>
+        <w:t>s Sources on GEE</w:t>
       </w:r>
     </w:p>
     <w:p>
@@ -831,7 +721,7 @@
         </w:rPr>
         <w:t xml:space="preserve">Sentinel-2 Harmonized: </w:t>
       </w:r>
-      <w:hyperlink r:id="rId5" w:history="1">
+      <w:hyperlink r:id="rId5" w:anchor="description" w:history="1">
         <w:r>
           <w:rPr>
             <w:rStyle w:val="Collegamentoipertestuale"/>
@@ -1677,6 +1567,7 @@
   <w:style w:type="character" w:default="1" w:styleId="Carpredefinitoparagrafo">
     <w:name w:val="Default Paragraph Font"/>
     <w:uiPriority w:val="1"/>
+    <w:semiHidden/>
     <w:unhideWhenUsed/>
   </w:style>
   <w:style w:type="table" w:default="1" w:styleId="Tabellanormale">

</xml_diff>